<commit_message>
Admin Statistics Specification: v1.1 - record 2026-09-12 Activity screen changes
Documents the chart removal, Monthly default, newest-to-oldest period sort,
and dropped +/-/net columns applied to the four Activity screens
(Accounts/Contacts/Requests/ToDos). Sum and Averages (Section 2) unchanged.

Co-Authored-By: Claude Sonnet 5 <noreply@anthropic.com>
</commit_message>
<xml_diff>
--- a/docs/WYP_Admin_Statistics_Specification_v1_0.docx
+++ b/docs/WYP_Admin_Statistics_Specification_v1_0.docx
@@ -45,7 +45,7 @@
           <w:sz w:val="22"/>
           <w:szCs w:val="22"/>
         </w:rPr>
-        <w:t xml:space="preserve">v1.0  ·  2026-09-07</w:t>
+        <w:t xml:space="preserve">v1.1  ·  2026-09-12</w:t>
       </w:r>
     </w:p>
     <w:p>
@@ -62,7 +62,7 @@
           <w:sz w:val="21"/>
           <w:szCs w:val="21"/>
         </w:rPr>
-        <w:t xml:space="preserve">Companion to the PRD and UI Design Specification, covering the admin-only Statistics tooling reached from Housekeeping → Statistics (visible only when the signed-in profile's is_admin flag is true). These screens are internal business/accounting tooling for the product owner, not part of the customer-facing product, and are documented here rather than in the customer UI spec. This is the first version of this document; it fully specifies Sum and Averages and lists the four existing Activity screens as build references pending their own full specification in a future revision.</w:t>
+        <w:t xml:space="preserve">Companion to the PRD and UI Design Specification, covering the admin-only Statistics tooling reached from Housekeeping → Statistics (visible only when the signed-in profile's is_admin flag is true). These screens are internal business/accounting tooling for the product owner, not part of the customer-facing product, and are documented here rather than in the customer UI spec. This document fully specifies Sum and Averages and lists the four existing Activity screens as build references pending their own full specification in a future revision. v1.1 additionally records screen-wide behavior changes made to all four Activity screens after v1.0 — see Section 3.</w:t>
       </w:r>
     </w:p>
     <w:p>
@@ -321,7 +321,7 @@
           <w:sz w:val="20"/>
           <w:szCs w:val="20"/>
         </w:rPr>
-        <w:t xml:space="preserve">the four Activity screens are unchanged by this revision; their build detail lives in wyp_decisions_log.md (2026-09-07 entries, migrations 053–064).</w:t>
+        <w:t xml:space="preserve">the four Activity screens were unchanged by v1.0; see Section 3 for the 2026-09-12 changes v1.1 records. Original build detail lives in wyp_decisions_log.md (2026-09-07 entries, migrations 053–064).</w:t>
       </w:r>
     </w:p>
     <w:p>
@@ -3282,7 +3282,24 @@
           <w:sz w:val="21"/>
           <w:szCs w:val="21"/>
         </w:rPr>
-        <w:t xml:space="preserve">The four screens below are live and unchanged by this revision. They have not yet been given a formal, section-numbered specification in this document — that is left for a future revision, in the same format used for Sum and Averages above.</w:t>
+        <w:t xml:space="preserve">The four screens below are live. They have not yet been given a formal, section-numbered specification in this document — that is left for a future revision, in the same format used for Sum and Averages above.</w:t>
+      </w:r>
+    </w:p>
+    <w:p>
+      <w:pPr>
+        <w:spacing w:after="160"/>
+      </w:pPr>
+      <w:r>
+        <w:rPr>
+          <w:b w:val="false"/>
+          <w:bCs w:val="false"/>
+          <w:i w:val="false"/>
+          <w:iCs w:val="false"/>
+          <w:color w:val="1A1A1A"/>
+          <w:sz w:val="21"/>
+          <w:szCs w:val="21"/>
+        </w:rPr>
+        <w:t xml:space="preserve">Updated 2026-09-12 (v1.1) — after reviewing the four live screens, the per-period bar/line charts were removed from all four (each screen’s own numbers table, already the print source of truth, is now the only rendering, on screen and in print alike); granularity now defaults to Monthly rather than Weekly; periods display newest-to-oldest (on screen, in print, and in the .xlsx export); and the diverging +/-/net columns were dropped (Contacts’ Added − Deleted; Requests’ and ToDos’ own Created − Deleted and Archived − Unarchived). See wyp_decisions_log.md, 2026-09-12.</w:t>
       </w:r>
     </w:p>
     <w:p>
@@ -3582,6 +3599,95 @@
                 <w:szCs w:val="19"/>
               </w:rPr>
               <w:t xml:space="preserve">Initial specification. Fully specifies Sum and Averages: Entities table and Volume table (replacing the original KPI stat-tile block) with percentage-based status breakdowns and new Dialog/Attachment average metrics, plus a simplified Roster. Lists the four existing Activity screens as build references pending their own full specification.</w:t>
+            </w:r>
+          </w:p>
+        </w:tc>
+      </w:tr>
+      <w:tr>
+        <w:tc>
+          <w:tcPr>
+            <w:tcW w:type="dxa" w:w="1000"/>
+            <w:tcMar>
+              <w:top w:type="dxa" w:w="80"/>
+              <w:left w:type="dxa" w:w="100"/>
+              <w:bottom w:type="dxa" w:w="80"/>
+              <w:right w:type="dxa" w:w="100"/>
+            </w:tcMar>
+            <w:vAlign w:val="center"/>
+          </w:tcPr>
+          <w:p>
+            <w:pPr>
+              <w:jc w:val="left"/>
+            </w:pPr>
+            <w:r>
+              <w:rPr>
+                <w:b w:val="false"/>
+                <w:bCs w:val="false"/>
+                <w:i w:val="false"/>
+                <w:iCs w:val="false"/>
+                <w:color w:val="1A1A1A"/>
+                <w:sz w:val="19"/>
+                <w:szCs w:val="19"/>
+              </w:rPr>
+              <w:t xml:space="preserve">v1.1</w:t>
+            </w:r>
+          </w:p>
+        </w:tc>
+        <w:tc>
+          <w:tcPr>
+            <w:tcW w:type="dxa" w:w="1000"/>
+            <w:tcMar>
+              <w:top w:type="dxa" w:w="80"/>
+              <w:left w:type="dxa" w:w="100"/>
+              <w:bottom w:type="dxa" w:w="80"/>
+              <w:right w:type="dxa" w:w="100"/>
+            </w:tcMar>
+            <w:vAlign w:val="center"/>
+          </w:tcPr>
+          <w:p>
+            <w:pPr>
+              <w:jc w:val="left"/>
+            </w:pPr>
+            <w:r>
+              <w:rPr>
+                <w:b w:val="false"/>
+                <w:bCs w:val="false"/>
+                <w:i w:val="false"/>
+                <w:iCs w:val="false"/>
+                <w:color w:val="1A1A1A"/>
+                <w:sz w:val="19"/>
+                <w:szCs w:val="19"/>
+              </w:rPr>
+              <w:t xml:space="preserve">2026-09-12</w:t>
+            </w:r>
+          </w:p>
+        </w:tc>
+        <w:tc>
+          <w:tcPr>
+            <w:tcW w:type="dxa" w:w="1000"/>
+            <w:tcMar>
+              <w:top w:type="dxa" w:w="80"/>
+              <w:left w:type="dxa" w:w="100"/>
+              <w:bottom w:type="dxa" w:w="80"/>
+              <w:right w:type="dxa" w:w="100"/>
+            </w:tcMar>
+            <w:vAlign w:val="center"/>
+          </w:tcPr>
+          <w:p>
+            <w:pPr>
+              <w:jc w:val="left"/>
+            </w:pPr>
+            <w:r>
+              <w:rPr>
+                <w:b w:val="false"/>
+                <w:bCs w:val="false"/>
+                <w:i w:val="false"/>
+                <w:iCs w:val="false"/>
+                <w:color w:val="1A1A1A"/>
+                <w:sz w:val="19"/>
+                <w:szCs w:val="19"/>
+              </w:rPr>
+              <w:t xml:space="preserve">Records 2026-09-12 changes to all four existing Activity screens (Accounts, Contacts, Requests, ToDos): removed per-period bar/line charts (numbers table only, as already printed); default granularity changed from Weekly to Monthly; periods now sort newest-to-oldest (screen, print, and .xlsx export); dropped the diverging +/-/net columns (Added − Deleted; Created − Deleted; Archived − Unarchived). Sum and Averages (Section 2) is unchanged.</w:t>
             </w:r>
           </w:p>
         </w:tc>

</xml_diff>